<commit_message>
corrige acentuacao no pdf, word e mensagens do programa
</commit_message>
<xml_diff>
--- a/apresentacao_sompo_risco_python.docx
+++ b/apresentacao_sompo_risco_python.docx
@@ -18,7 +18,7 @@
         <w:rPr>
           <w:i/>
         </w:rPr>
-        <w:t>MVP de Analise de Risco Operacional (Python)</w:t>
+        <w:t>MVP de Análise de Risco Operacional (Python)</w:t>
       </w:r>
     </w:p>
     <w:p>
@@ -28,7 +28,7 @@
     </w:p>
     <w:p>
       <w:r>
-        <w:t>Professor: Kevin Allan Sales Rodrigues</w:t>
+        <w:t>Professor: Kévin Allan Sales Rodrigues</w:t>
       </w:r>
     </w:p>
     <w:p>
@@ -46,7 +46,7 @@
     </w:p>
     <w:p>
       <w:r>
-        <w:t>MVP em Python que recebe dados operacionais de equipamentos (telemetria real ou simulada), processa essas informacoes num motor de risco e gera saidas interpretaveis: score, classificacao e alertas. E a primeira versao do backend de analise de risco do projeto Sompo Seguros nessa disciplina, conectando a entrada de dados ao modelo de risco.</w:t>
+        <w:t>MVP em Python que recebe dados operacionais de equipamentos (telemetria real ou simulada), processa essas informações num motor de risco e gera saídas interpretáveis: score, classificação e alertas. É a primeira versão do backend de análise de risco do projeto Sompo Seguros nessa disciplina, conectando a entrada de dados ao modelo de risco.</w:t>
       </w:r>
     </w:p>
     <w:p>
@@ -129,7 +129,7 @@
               <w:rPr>
                 <w:sz w:val="19"/>
               </w:rPr>
-              <w:t>Pipeline: entrada -&gt; processamento -&gt; saida</w:t>
+              <w:t>Pipeline: entrada -&gt; processamento -&gt; saída</w:t>
             </w:r>
           </w:p>
         </w:tc>
@@ -159,7 +159,7 @@
               <w:rPr>
                 <w:sz w:val="19"/>
               </w:rPr>
-              <w:t>Leitura da planilha e validacao de dados obrigatorios</w:t>
+              <w:t>Leitura da planilha e validação de dados obrigatórios</w:t>
             </w:r>
           </w:p>
         </w:tc>
@@ -189,7 +189,7 @@
               <w:rPr>
                 <w:sz w:val="19"/>
               </w:rPr>
-              <w:t>Simulacao de sensores/API (telemetria, ambiente, operacao)</w:t>
+              <w:t>Simulação de sensores/API (telemetria, ambiente, operação)</w:t>
             </w:r>
           </w:p>
         </w:tc>
@@ -219,7 +219,7 @@
               <w:rPr>
                 <w:sz w:val="19"/>
               </w:rPr>
-              <w:t>Calculo do score, classificacao, fator principal e alertas</w:t>
+              <w:t>Cálculo do score, classificação, fator principal e alertas</w:t>
             </w:r>
           </w:p>
         </w:tc>
@@ -249,7 +249,7 @@
               <w:rPr>
                 <w:sz w:val="19"/>
               </w:rPr>
-              <w:t>Resumo no console, exportacoes (CSV/JSON) e grafico</w:t>
+              <w:t>Resumo no console, exportações (CSV/JSON) e gráfico</w:t>
             </w:r>
           </w:p>
         </w:tc>
@@ -266,12 +266,12 @@
         <w:pStyle w:val="Heading1"/>
       </w:pPr>
       <w:r>
-        <w:t>Regras de negocio implementadas</w:t>
+        <w:t>Regras de negócio implementadas</w:t>
       </w:r>
     </w:p>
     <w:p>
       <w:r>
-        <w:t>O score de risco (0-100) e calculado a partir de quatro indicadores de telemetria, com pesos definidos para este MVP:</w:t>
+        <w:t>O score de risco (0-100) é calculado a partir de quatro indicadores de telemetria, com pesos definidos para este MVP:</w:t>
       </w:r>
     </w:p>
     <w:tbl>
@@ -317,7 +317,7 @@
                 <w:color w:val="FFFFFF"/>
                 <w:sz w:val="19"/>
               </w:rPr>
-              <w:t>Direcao</w:t>
+              <w:t>Direção</w:t>
             </w:r>
           </w:p>
         </w:tc>
@@ -334,7 +334,7 @@
                 <w:color w:val="FFFFFF"/>
                 <w:sz w:val="19"/>
               </w:rPr>
-              <w:t>Peso maximo</w:t>
+              <w:t>Peso máximo</w:t>
             </w:r>
           </w:p>
         </w:tc>
@@ -350,7 +350,7 @@
               <w:rPr>
                 <w:sz w:val="19"/>
               </w:rPr>
-              <w:t>Estilo de conducao (nota 0-10)</w:t>
+              <w:t>Estilo de condução (nota 0-10)</w:t>
             </w:r>
           </w:p>
         </w:tc>
@@ -394,7 +394,7 @@
               <w:rPr>
                 <w:sz w:val="19"/>
               </w:rPr>
-              <w:t>Estilo de conducao na frenagem (nota 0-10)</w:t>
+              <w:t>Estilo de condução na frenagem (nota 0-10)</w:t>
             </w:r>
           </w:p>
         </w:tc>
@@ -482,7 +482,7 @@
               <w:rPr>
                 <w:sz w:val="19"/>
               </w:rPr>
-              <w:t>Desaceleracao / total percorrido (%)</w:t>
+              <w:t>Desaceleração / total percorrido (%)</w:t>
             </w:r>
           </w:p>
         </w:tc>
@@ -559,7 +559,7 @@
                 <w:color w:val="FFFFFF"/>
                 <w:sz w:val="19"/>
               </w:rPr>
-              <w:t>Classificacao</w:t>
+              <w:t>Classificação</w:t>
             </w:r>
           </w:p>
         </w:tc>
@@ -730,7 +730,7 @@
                 <w:color w:val="FFFFFF"/>
                 <w:sz w:val="19"/>
               </w:rPr>
-              <w:t>Classificacao</w:t>
+              <w:t>Classificação</w:t>
             </w:r>
           </w:p>
         </w:tc>
@@ -1213,7 +1213,7 @@
                 <w:color w:val="FFFFFF"/>
                 <w:sz w:val="19"/>
               </w:rPr>
-              <w:t>Periodo</w:t>
+              <w:t>Período</w:t>
             </w:r>
           </w:p>
         </w:tc>
@@ -1247,7 +1247,7 @@
                 <w:color w:val="FFFFFF"/>
                 <w:sz w:val="19"/>
               </w:rPr>
-              <w:t>Classificacao</w:t>
+              <w:t>Classificação</w:t>
             </w:r>
           </w:p>
         </w:tc>
@@ -1713,7 +1713,7 @@
         <w:pStyle w:val="Heading1"/>
       </w:pPr>
       <w:r>
-        <w:t>Requisitos tecnicos atendidos</w:t>
+        <w:t>Requisitos técnicos atendidos</w:t>
       </w:r>
     </w:p>
     <w:tbl>
@@ -1758,7 +1758,7 @@
                 <w:color w:val="FFFFFF"/>
                 <w:sz w:val="19"/>
               </w:rPr>
-              <w:t>Onde esta</w:t>
+              <w:t>Onde está</w:t>
             </w:r>
           </w:p>
         </w:tc>
@@ -1774,7 +1774,7 @@
               <w:rPr>
                 <w:sz w:val="19"/>
               </w:rPr>
-              <w:t>Funcoes para modularizar o fluxo</w:t>
+              <w:t>Funções para modularizar o fluxo</w:t>
             </w:r>
           </w:p>
         </w:tc>
@@ -1804,7 +1804,7 @@
               <w:rPr>
                 <w:sz w:val="19"/>
               </w:rPr>
-              <w:t>Estruturas condicionais (validacao, classificacao, alertas)</w:t>
+              <w:t>Estruturas condicionais (validação, classificação, alertas)</w:t>
             </w:r>
           </w:p>
         </w:tc>
@@ -1848,7 +1848,7 @@
               <w:rPr>
                 <w:sz w:val="19"/>
               </w:rPr>
-              <w:t>Leitura, limpeza e agregacao dos dados</w:t>
+              <w:t>Leitura, limpeza e agregação dos dados</w:t>
             </w:r>
           </w:p>
         </w:tc>
@@ -1864,7 +1864,7 @@
               <w:rPr>
                 <w:sz w:val="19"/>
               </w:rPr>
-              <w:t>Pipeline claro (entrada / processamento / saida)</w:t>
+              <w:t>Pipeline claro (entrada / processamento / saída)</w:t>
             </w:r>
           </w:p>
         </w:tc>
@@ -1908,7 +1908,7 @@
               <w:rPr>
                 <w:sz w:val="19"/>
               </w:rPr>
-              <w:t>Ver link do repositorio abaixo</w:t>
+              <w:t>Ver link do repositório abaixo</w:t>
             </w:r>
           </w:p>
         </w:tc>
@@ -1981,7 +1981,7 @@
               <w:rPr>
                 <w:sz w:val="19"/>
               </w:rPr>
-              <w:t>Backend modular com funcoes</w:t>
+              <w:t>Backend modular com funções</w:t>
             </w:r>
           </w:p>
         </w:tc>
@@ -2011,7 +2011,7 @@
               <w:rPr>
                 <w:sz w:val="19"/>
               </w:rPr>
-              <w:t>Integracao com o modelo de risco</w:t>
+              <w:t>Integração com o modelo de risco</w:t>
             </w:r>
           </w:p>
         </w:tc>
@@ -2041,7 +2041,7 @@
               <w:rPr>
                 <w:sz w:val="19"/>
               </w:rPr>
-              <w:t>Entrada e validacao de dados (reais ou simulados)</w:t>
+              <w:t>Entrada e validação de dados (reais ou simulados)</w:t>
             </w:r>
           </w:p>
         </w:tc>
@@ -2071,7 +2071,7 @@
               <w:rPr>
                 <w:sz w:val="19"/>
               </w:rPr>
-              <w:t>Simulacao de sensores/API (telemetria, ambiente, operacao)</w:t>
+              <w:t>Simulação de sensores/API (telemetria, ambiente, operação)</w:t>
             </w:r>
           </w:p>
         </w:tc>
@@ -2101,7 +2101,7 @@
               <w:rPr>
                 <w:sz w:val="19"/>
               </w:rPr>
-              <w:t>Saidas interpretaveis (score, classificacao, alertas)</w:t>
+              <w:t>Saídas interpretáveis (score, classificação, alertas)</w:t>
             </w:r>
           </w:p>
         </w:tc>
@@ -2131,7 +2131,7 @@
               <w:rPr>
                 <w:sz w:val="19"/>
               </w:rPr>
-              <w:t>Relatorios/dashboards simples e fatores de risco</w:t>
+              <w:t>Relatórios/dashboards simples e fatores de risco</w:t>
             </w:r>
           </w:p>
         </w:tc>
@@ -2161,7 +2161,7 @@
               <w:rPr>
                 <w:sz w:val="19"/>
               </w:rPr>
-              <w:t>Consulta rapida dos resultados</w:t>
+              <w:t>Consulta rápida dos resultados</w:t>
             </w:r>
           </w:p>
         </w:tc>
@@ -2191,7 +2191,7 @@
               <w:rPr>
                 <w:sz w:val="19"/>
               </w:rPr>
-              <w:t>Validacao funcional do MVP (testado end-to-end)</w:t>
+              <w:t>Validação funcional do MVP (testado end-to-end)</w:t>
             </w:r>
           </w:p>
         </w:tc>
@@ -2217,12 +2217,12 @@
         <w:pStyle w:val="Heading1"/>
       </w:pPr>
       <w:r>
-        <w:t>Codigo-fonte</w:t>
+        <w:t>Código-fonte</w:t>
       </w:r>
     </w:p>
     <w:p>
       <w:r>
-        <w:t>Repositorio (privado, acesso mediante convite): github.com/susuelen153-design/sompo-risco-python</w:t>
+        <w:t>Repositório (privado, acesso mediante convite): github.com/susuelen153-design/sompo-risco-python</w:t>
       </w:r>
     </w:p>
     <w:sectPr>

</xml_diff>

<commit_message>
Regenera a apresentacao com os numeros pos-correcao
O PDF e o DOCX tinham sido gerados antes do teto da desaceleracao: traziam
score maximo 66 e o ranking de fatores 895/605. Com o teto aplicado os
numeros corretos sao 64 e 905/595.

A tabela de pesos tambem dizia "~15 pontos" para a desaceleracao, o que era
impreciso; agora diz "15 pontos (limitado a 30%)", coerente com
TETO_DESACELERACAO_PCT em src/risco.py e com o README.
</commit_message>
<xml_diff>
--- a/apresentacao_sompo_risco_python.docx
+++ b/apresentacao_sompo_risco_python.docx
@@ -510,7 +510,7 @@
               <w:rPr>
                 <w:sz w:val="19"/>
               </w:rPr>
-              <w:t>~15 pontos</w:t>
+              <w:t>15 pontos (limitado a 30%)</w:t>
             </w:r>
           </w:p>
         </w:tc>
@@ -1049,7 +1049,7 @@
               <w:rPr>
                 <w:sz w:val="19"/>
               </w:rPr>
-              <w:t>Estilo de conducao</w:t>
+              <w:t>Estilo de condução</w:t>
             </w:r>
           </w:p>
         </w:tc>
@@ -1063,7 +1063,7 @@
               <w:rPr>
                 <w:sz w:val="19"/>
               </w:rPr>
-              <w:t>895</w:t>
+              <w:t>905</w:t>
             </w:r>
           </w:p>
         </w:tc>
@@ -1079,7 +1079,7 @@
               <w:rPr>
                 <w:sz w:val="19"/>
               </w:rPr>
-              <w:t>Desaceleracao/frenagem brusca</w:t>
+              <w:t>Desaceleração/frenagem brusca</w:t>
             </w:r>
           </w:p>
         </w:tc>
@@ -1093,7 +1093,7 @@
               <w:rPr>
                 <w:sz w:val="19"/>
               </w:rPr>
-              <w:t>605</w:t>
+              <w:t>595</w:t>
             </w:r>
           </w:p>
         </w:tc>
@@ -1280,150 +1280,6 @@
               <w:rPr>
                 <w:sz w:val="19"/>
               </w:rPr>
-              <w:t>Caminhão da Olívia 4</w:t>
-            </w:r>
-          </w:p>
-        </w:tc>
-        <w:tc>
-          <w:tcPr>
-            <w:tcW w:type="dxa" w:w="1531"/>
-          </w:tcPr>
-          <w:p>
-            <w:r/>
-            <w:r>
-              <w:rPr>
-                <w:sz w:val="19"/>
-              </w:rPr>
-              <w:t>Julho 2026</w:t>
-            </w:r>
-          </w:p>
-        </w:tc>
-        <w:tc>
-          <w:tcPr>
-            <w:tcW w:type="dxa" w:w="1020"/>
-          </w:tcPr>
-          <w:p>
-            <w:r/>
-            <w:r>
-              <w:rPr>
-                <w:sz w:val="19"/>
-              </w:rPr>
-              <w:t>66</w:t>
-            </w:r>
-          </w:p>
-        </w:tc>
-        <w:tc>
-          <w:tcPr>
-            <w:tcW w:type="dxa" w:w="1701"/>
-          </w:tcPr>
-          <w:p>
-            <w:r/>
-            <w:r>
-              <w:rPr>
-                <w:sz w:val="19"/>
-              </w:rPr>
-              <w:t>ALTO</w:t>
-            </w:r>
-          </w:p>
-        </w:tc>
-        <w:tc>
-          <w:tcPr>
-            <w:tcW w:type="dxa" w:w="2551"/>
-          </w:tcPr>
-          <w:p>
-            <w:r/>
-            <w:r>
-              <w:rPr>
-                <w:sz w:val="19"/>
-              </w:rPr>
-              <w:t>Desaceleracao/frenagem brusca</w:t>
-            </w:r>
-          </w:p>
-        </w:tc>
-      </w:tr>
-      <w:tr>
-        <w:tc>
-          <w:tcPr>
-            <w:tcW w:type="dxa" w:w="2268"/>
-          </w:tcPr>
-          <w:p>
-            <w:r/>
-            <w:r>
-              <w:rPr>
-                <w:sz w:val="19"/>
-              </w:rPr>
-              <w:t>Caminhão do Heitor 2</w:t>
-            </w:r>
-          </w:p>
-        </w:tc>
-        <w:tc>
-          <w:tcPr>
-            <w:tcW w:type="dxa" w:w="1531"/>
-          </w:tcPr>
-          <w:p>
-            <w:r/>
-            <w:r>
-              <w:rPr>
-                <w:sz w:val="19"/>
-              </w:rPr>
-              <w:t>Abril 2026</w:t>
-            </w:r>
-          </w:p>
-        </w:tc>
-        <w:tc>
-          <w:tcPr>
-            <w:tcW w:type="dxa" w:w="1020"/>
-          </w:tcPr>
-          <w:p>
-            <w:r/>
-            <w:r>
-              <w:rPr>
-                <w:sz w:val="19"/>
-              </w:rPr>
-              <w:t>66</w:t>
-            </w:r>
-          </w:p>
-        </w:tc>
-        <w:tc>
-          <w:tcPr>
-            <w:tcW w:type="dxa" w:w="1701"/>
-          </w:tcPr>
-          <w:p>
-            <w:r/>
-            <w:r>
-              <w:rPr>
-                <w:sz w:val="19"/>
-              </w:rPr>
-              <w:t>ALTO</w:t>
-            </w:r>
-          </w:p>
-        </w:tc>
-        <w:tc>
-          <w:tcPr>
-            <w:tcW w:type="dxa" w:w="2551"/>
-          </w:tcPr>
-          <w:p>
-            <w:r/>
-            <w:r>
-              <w:rPr>
-                <w:sz w:val="19"/>
-              </w:rPr>
-              <w:t>Estilo de conducao</w:t>
-            </w:r>
-          </w:p>
-        </w:tc>
-      </w:tr>
-      <w:tr>
-        <w:tc>
-          <w:tcPr>
-            <w:tcW w:type="dxa" w:w="2268"/>
-          </w:tcPr>
-          <w:p>
-            <w:r/>
-            <w:r>
-              <w:rPr>
-                <w:sz w:val="19"/>
-              </w:rPr>
               <w:t>Caminhão do Heitor 2</w:t>
             </w:r>
           </w:p>
@@ -1452,7 +1308,7 @@
               <w:rPr>
                 <w:sz w:val="19"/>
               </w:rPr>
-              <w:t>66</w:t>
+              <w:t>64</w:t>
             </w:r>
           </w:p>
         </w:tc>
@@ -1480,7 +1336,7 @@
               <w:rPr>
                 <w:sz w:val="19"/>
               </w:rPr>
-              <w:t>Estilo de conducao</w:t>
+              <w:t>Estilo de condução</w:t>
             </w:r>
           </w:p>
         </w:tc>
@@ -1524,7 +1380,7 @@
               <w:rPr>
                 <w:sz w:val="19"/>
               </w:rPr>
-              <w:t>65</w:t>
+              <w:t>64</w:t>
             </w:r>
           </w:p>
         </w:tc>
@@ -1552,79 +1408,7 @@
               <w:rPr>
                 <w:sz w:val="19"/>
               </w:rPr>
-              <w:t>Estilo de conducao</w:t>
-            </w:r>
-          </w:p>
-        </w:tc>
-      </w:tr>
-      <w:tr>
-        <w:tc>
-          <w:tcPr>
-            <w:tcW w:type="dxa" w:w="2268"/>
-          </w:tcPr>
-          <w:p>
-            <w:r/>
-            <w:r>
-              <w:rPr>
-                <w:sz w:val="19"/>
-              </w:rPr>
-              <w:t>Caminhão do Fernando 3</w:t>
-            </w:r>
-          </w:p>
-        </w:tc>
-        <w:tc>
-          <w:tcPr>
-            <w:tcW w:type="dxa" w:w="1531"/>
-          </w:tcPr>
-          <w:p>
-            <w:r/>
-            <w:r>
-              <w:rPr>
-                <w:sz w:val="19"/>
-              </w:rPr>
-              <w:t>Junho 2026</w:t>
-            </w:r>
-          </w:p>
-        </w:tc>
-        <w:tc>
-          <w:tcPr>
-            <w:tcW w:type="dxa" w:w="1020"/>
-          </w:tcPr>
-          <w:p>
-            <w:r/>
-            <w:r>
-              <w:rPr>
-                <w:sz w:val="19"/>
-              </w:rPr>
-              <w:t>65</w:t>
-            </w:r>
-          </w:p>
-        </w:tc>
-        <w:tc>
-          <w:tcPr>
-            <w:tcW w:type="dxa" w:w="1701"/>
-          </w:tcPr>
-          <w:p>
-            <w:r/>
-            <w:r>
-              <w:rPr>
-                <w:sz w:val="19"/>
-              </w:rPr>
-              <w:t>ALTO</w:t>
-            </w:r>
-          </w:p>
-        </w:tc>
-        <w:tc>
-          <w:tcPr>
-            <w:tcW w:type="dxa" w:w="2551"/>
-          </w:tcPr>
-          <w:p>
-            <w:r/>
-            <w:r>
-              <w:rPr>
-                <w:sz w:val="19"/>
-              </w:rPr>
-              <w:t>Estilo de conducao</w:t>
+              <w:t>Estilo de condução</w:t>
             </w:r>
           </w:p>
         </w:tc>
@@ -1668,7 +1452,7 @@
               <w:rPr>
                 <w:sz w:val="19"/>
               </w:rPr>
-              <w:t>65</w:t>
+              <w:t>64</w:t>
             </w:r>
           </w:p>
         </w:tc>
@@ -1696,7 +1480,223 @@
               <w:rPr>
                 <w:sz w:val="19"/>
               </w:rPr>
-              <w:t>Estilo de conducao</w:t>
+              <w:t>Estilo de condução</w:t>
+            </w:r>
+          </w:p>
+        </w:tc>
+      </w:tr>
+      <w:tr>
+        <w:tc>
+          <w:tcPr>
+            <w:tcW w:type="dxa" w:w="2268"/>
+          </w:tcPr>
+          <w:p>
+            <w:r/>
+            <w:r>
+              <w:rPr>
+                <w:sz w:val="19"/>
+              </w:rPr>
+              <w:t>Caminhão do Heitor 2</w:t>
+            </w:r>
+          </w:p>
+        </w:tc>
+        <w:tc>
+          <w:tcPr>
+            <w:tcW w:type="dxa" w:w="1531"/>
+          </w:tcPr>
+          <w:p>
+            <w:r/>
+            <w:r>
+              <w:rPr>
+                <w:sz w:val="19"/>
+              </w:rPr>
+              <w:t>Maio 2026</w:t>
+            </w:r>
+          </w:p>
+        </w:tc>
+        <w:tc>
+          <w:tcPr>
+            <w:tcW w:type="dxa" w:w="1020"/>
+          </w:tcPr>
+          <w:p>
+            <w:r/>
+            <w:r>
+              <w:rPr>
+                <w:sz w:val="19"/>
+              </w:rPr>
+              <w:t>63</w:t>
+            </w:r>
+          </w:p>
+        </w:tc>
+        <w:tc>
+          <w:tcPr>
+            <w:tcW w:type="dxa" w:w="1701"/>
+          </w:tcPr>
+          <w:p>
+            <w:r/>
+            <w:r>
+              <w:rPr>
+                <w:sz w:val="19"/>
+              </w:rPr>
+              <w:t>ALTO</w:t>
+            </w:r>
+          </w:p>
+        </w:tc>
+        <w:tc>
+          <w:tcPr>
+            <w:tcW w:type="dxa" w:w="2551"/>
+          </w:tcPr>
+          <w:p>
+            <w:r/>
+            <w:r>
+              <w:rPr>
+                <w:sz w:val="19"/>
+              </w:rPr>
+              <w:t>Estilo de condução</w:t>
+            </w:r>
+          </w:p>
+        </w:tc>
+      </w:tr>
+      <w:tr>
+        <w:tc>
+          <w:tcPr>
+            <w:tcW w:type="dxa" w:w="2268"/>
+          </w:tcPr>
+          <w:p>
+            <w:r/>
+            <w:r>
+              <w:rPr>
+                <w:sz w:val="19"/>
+              </w:rPr>
+              <w:t>Caminhão da Teresa</w:t>
+            </w:r>
+          </w:p>
+        </w:tc>
+        <w:tc>
+          <w:tcPr>
+            <w:tcW w:type="dxa" w:w="1531"/>
+          </w:tcPr>
+          <w:p>
+            <w:r/>
+            <w:r>
+              <w:rPr>
+                <w:sz w:val="19"/>
+              </w:rPr>
+              <w:t>Abril 2026</w:t>
+            </w:r>
+          </w:p>
+        </w:tc>
+        <w:tc>
+          <w:tcPr>
+            <w:tcW w:type="dxa" w:w="1020"/>
+          </w:tcPr>
+          <w:p>
+            <w:r/>
+            <w:r>
+              <w:rPr>
+                <w:sz w:val="19"/>
+              </w:rPr>
+              <w:t>63</w:t>
+            </w:r>
+          </w:p>
+        </w:tc>
+        <w:tc>
+          <w:tcPr>
+            <w:tcW w:type="dxa" w:w="1701"/>
+          </w:tcPr>
+          <w:p>
+            <w:r/>
+            <w:r>
+              <w:rPr>
+                <w:sz w:val="19"/>
+              </w:rPr>
+              <w:t>ALTO</w:t>
+            </w:r>
+          </w:p>
+        </w:tc>
+        <w:tc>
+          <w:tcPr>
+            <w:tcW w:type="dxa" w:w="2551"/>
+          </w:tcPr>
+          <w:p>
+            <w:r/>
+            <w:r>
+              <w:rPr>
+                <w:sz w:val="19"/>
+              </w:rPr>
+              <w:t>Estilo de condução</w:t>
+            </w:r>
+          </w:p>
+        </w:tc>
+      </w:tr>
+      <w:tr>
+        <w:tc>
+          <w:tcPr>
+            <w:tcW w:type="dxa" w:w="2268"/>
+          </w:tcPr>
+          <w:p>
+            <w:r/>
+            <w:r>
+              <w:rPr>
+                <w:sz w:val="19"/>
+              </w:rPr>
+              <w:t>Caminhão do Márcio</w:t>
+            </w:r>
+          </w:p>
+        </w:tc>
+        <w:tc>
+          <w:tcPr>
+            <w:tcW w:type="dxa" w:w="1531"/>
+          </w:tcPr>
+          <w:p>
+            <w:r/>
+            <w:r>
+              <w:rPr>
+                <w:sz w:val="19"/>
+              </w:rPr>
+              <w:t>Abril 2026</w:t>
+            </w:r>
+          </w:p>
+        </w:tc>
+        <w:tc>
+          <w:tcPr>
+            <w:tcW w:type="dxa" w:w="1020"/>
+          </w:tcPr>
+          <w:p>
+            <w:r/>
+            <w:r>
+              <w:rPr>
+                <w:sz w:val="19"/>
+              </w:rPr>
+              <w:t>63</w:t>
+            </w:r>
+          </w:p>
+        </w:tc>
+        <w:tc>
+          <w:tcPr>
+            <w:tcW w:type="dxa" w:w="1701"/>
+          </w:tcPr>
+          <w:p>
+            <w:r/>
+            <w:r>
+              <w:rPr>
+                <w:sz w:val="19"/>
+              </w:rPr>
+              <w:t>ALTO</w:t>
+            </w:r>
+          </w:p>
+        </w:tc>
+        <w:tc>
+          <w:tcPr>
+            <w:tcW w:type="dxa" w:w="2551"/>
+          </w:tcPr>
+          <w:p>
+            <w:r/>
+            <w:r>
+              <w:rPr>
+                <w:sz w:val="19"/>
+              </w:rPr>
+              <w:t>Estilo de frenagem</w:t>
             </w:r>
           </w:p>
         </w:tc>

</xml_diff>